<commit_message>
Prepare project cost and presentation deliverables
</commit_message>
<xml_diff>
--- a/CCD_Lab_Mini_Project_Report.docx
+++ b/CCD_Lab_Mini_Project_Report.docx
@@ -3792,6 +3792,86 @@
     </w:p>
     <w:p>
       <w:pPr>
+        <w:spacing w:before="240" w:after="100" w:line="300" w:lineRule="auto"/>
+        <w:keepNext/>
+      </w:pPr>
+      <w:r>
+        <w:rPr>
+          <w:rFonts w:ascii="Times New Roman" w:hAnsi="Times New Roman" w:cs="Times New Roman" w:eastAsia="Times New Roman"/>
+          <w:sz w:val="26"/>
+          <w:szCs w:val="26"/>
+          <w:b/>
+          <w:color w:val="1F4E79"/>
+        </w:rPr>
+        <w:t xml:space="preserve">3.6 Cost analysis</w:t>
+      </w:r>
+    </w:p>
+    <w:p>
+      <w:pPr>
+        <w:jc w:val="both"/>
+        <w:spacing w:before="0" w:after="150" w:line="300" w:lineRule="auto"/>
+        <w:ind w:left="0" w:firstLine="360"/>
+      </w:pPr>
+      <w:r>
+        <w:rPr>
+          <w:rFonts w:ascii="Times New Roman" w:hAnsi="Times New Roman" w:cs="Times New Roman" w:eastAsia="Times New Roman"/>
+          <w:sz w:val="24"/>
+          <w:szCs w:val="24"/>
+          <w:color w:val="222222"/>
+        </w:rPr>
+        <w:t xml:space="preserve">The Sydney on-demand model estimates about $47.31 per month before taxes, credits, and variable charges. It assumes 730 hours, one EC2 t3.small host, one public IPv4 address, one Single-AZ RDS MySQL db.t4g.micro instance, the configured 30 GB EC2 and 20 GB RDS gp3 volumes, one Secrets Manager secret, and 1 GB of ECR image storage.</w:t>
+      </w:r>
+    </w:p>
+    <w:p>
+      <w:pPr>
+        <w:jc w:val="both"/>
+        <w:spacing w:before="0" w:after="150" w:line="300" w:lineRule="auto"/>
+        <w:ind w:left="0" w:firstLine="360"/>
+      </w:pPr>
+      <w:r>
+        <w:rPr>
+          <w:rFonts w:ascii="Times New Roman" w:hAnsi="Times New Roman" w:cs="Times New Roman" w:eastAsia="Times New Roman"/>
+          <w:sz w:val="24"/>
+          <w:szCs w:val="24"/>
+          <w:color w:val="222222"/>
+        </w:rPr>
+        <w:t xml:space="preserve">Estimated monthly line items are EC2 compute $19.27; EC2 gp3 disk $2.88; public IPv4 $3.65; RDS compute $18.25; RDS gp3 storage $2.76; Secrets Manager $0.40; and assumed ECR storage $0.10. The calculation and assumptions are in COST_ANALYSIS.md; AWS pricing sources [11]–[15] are listed in References.</w:t>
+      </w:r>
+    </w:p>
+    <w:p>
+      <w:pPr>
+        <w:jc w:val="both"/>
+        <w:spacing w:before="0" w:after="150" w:line="300" w:lineRule="auto"/>
+        <w:ind w:left="0" w:firstLine="360"/>
+      </w:pPr>
+      <w:r>
+        <w:rPr>
+          <w:rFonts w:ascii="Times New Roman" w:hAnsi="Times New Roman" w:cs="Times New Roman" w:eastAsia="Times New Roman"/>
+          <w:sz w:val="24"/>
+          <w:szCs w:val="24"/>
+          <w:color w:val="222222"/>
+        </w:rPr>
+        <w:t xml:space="preserve">The HPA changes API pod count on the same fixed EC2 and RDS resources, so pod scale-up or scale-down has approximately $0 effect on these provisioned hourly charges. A hypothetical additional worker node used for 146 hours per month would have $3.85 compute cost versus $19.27 if kept on for 730 hours; the $15.42 difference is compute-only, projected, and not implemented.</w:t>
+      </w:r>
+    </w:p>
+    <w:p>
+      <w:pPr>
+        <w:jc w:val="both"/>
+        <w:spacing w:before="0" w:after="150" w:line="300" w:lineRule="auto"/>
+        <w:ind w:left="0" w:firstLine="360"/>
+      </w:pPr>
+      <w:r>
+        <w:rPr>
+          <w:rFonts w:ascii="Times New Roman" w:hAnsi="Times New Roman" w:cs="Times New Roman" w:eastAsia="Times New Roman"/>
+          <w:sz w:val="24"/>
+          <w:szCs w:val="24"/>
+          <w:color w:val="222222"/>
+        </w:rPr>
+        <w:t xml:space="preserve">This is a list-price model, not the AWS account bill. AWS CLI credentials were unavailable for Cost Explorer verification. The estimate excludes taxes, variable data transfer, backup/snapshot amounts beyond included allowances, any RDS CPU-credit surplus, and other account resources. Confirm current regional rates and free-plan eligibility in the AWS billing console and Pricing Calculator.</w:t>
+      </w:r>
+    </w:p>
+    <w:p>
+      <w:pPr>
         <w:jc w:val="center"/>
         <w:spacing w:before="0" w:after="80" w:line="360" w:lineRule="auto"/>
         <w:keepNext/>
@@ -3869,7 +3949,7 @@
           <w:szCs w:val="24"/>
           <w:color w:val="222222"/>
         </w:rPr>
-        <w:t xml:space="preserve">The main limitations are the single EC2 node, the HPA maximum of two pods, temporary Prometheus and Grafana storage, expiring ECR pull credentials, and the absence of automated ECR publishing and cluster rollout in GitHub Actions. Authentication and per-student task ownership are also outside the current application scope. The experiments do not prove host-level availability, multi-node resilience, production security, or lower AWS costs from pod scaling; the underlying EC2 and RDS remain provisioned at fixed capacity.</w:t>
+        <w:t xml:space="preserve">The main limitations are the single EC2 node, the HPA maximum of two pods, temporary Prometheus and Grafana storage, expiring ECR pull credentials, and the manual AWS release workflow prepared but awaiting OIDC role configuration in GitHub Actions. Authentication and per-student task ownership are also outside the current application scope. The experiments do not prove host-level availability, multi-node resilience, production security, or lower AWS costs from pod scaling; the underlying EC2 and RDS remain provisioned at fixed capacity.</w:t>
       </w:r>
     </w:p>
     <w:p>
@@ -3885,7 +3965,7 @@
           <w:szCs w:val="24"/>
           <w:color w:val="222222"/>
         </w:rPr>
-        <w:t xml:space="preserve">Future work should add a multi-node cluster or managed Kubernetes option, automate image publishing and deployment through a controlled CI/CD workflow, rotate ECR access automatically, persist monitoring data, and add authentication with per-user authorization. The team should also test write workloads, longer runs, database failure/recovery, and host-level disruption. Before any extended deployment, monitor the AWS bill and remove demonstration resources when they are no longer needed.</w:t>
+        <w:t xml:space="preserve">Future work should add a multi-node cluster or managed Kubernetes option, configure and exercise the prepared manual image-publishing and deployment workflow, rotate ECR access automatically, persist monitoring data, and add authentication with per-user authorization. The team should also test write workloads, longer runs, database failure/recovery, and host-level disruption. Before any extended deployment, monitor the AWS bill and remove demonstration resources when they are no longer needed.</w:t>
       </w:r>
     </w:p>
     <w:p>
@@ -4064,6 +4144,86 @@
           <w:color w:val="222222"/>
         </w:rPr>
         <w:t xml:space="preserve">[10] Myisha Siddiqui, Manan Bhasin, and Rishabh Raj, “Student Task Manager: implementation, manifests, and demo evidence,” project repository and internal test record, Oct. 2026.</w:t>
+      </w:r>
+    </w:p>
+    <w:p>
+      <w:pPr>
+        <w:jc w:val="both"/>
+        <w:spacing w:before="30" w:after="150" w:line="260" w:lineRule="auto"/>
+        <w:ind w:left="420" w:firstLine="-420"/>
+      </w:pPr>
+      <w:r>
+        <w:rPr>
+          <w:rFonts w:ascii="Times New Roman" w:hAnsi="Times New Roman" w:cs="Times New Roman" w:eastAsia="Times New Roman"/>
+          <w:sz w:val="20"/>
+          <w:szCs w:val="20"/>
+          <w:color w:val="222222"/>
+        </w:rPr>
+        <w:t xml:space="preserve">[11] Amazon Web Services, “Amazon EC2 T3 Instances,” AWS. [Online]. Available: https://aws.amazon.com/ec2/instance-types/t3/. [Accessed: Oct. 25, 2026].</w:t>
+      </w:r>
+    </w:p>
+    <w:p>
+      <w:pPr>
+        <w:jc w:val="both"/>
+        <w:spacing w:before="30" w:after="150" w:line="260" w:lineRule="auto"/>
+        <w:ind w:left="420" w:firstLine="-420"/>
+      </w:pPr>
+      <w:r>
+        <w:rPr>
+          <w:rFonts w:ascii="Times New Roman" w:hAnsi="Times New Roman" w:cs="Times New Roman" w:eastAsia="Times New Roman"/>
+          <w:sz w:val="20"/>
+          <w:szCs w:val="20"/>
+          <w:color w:val="222222"/>
+        </w:rPr>
+        <w:t xml:space="preserve">[12] Amazon Web Services, “Amazon RDS for MySQL Pricing,” AWS. [Online]. Available: https://aws.amazon.com/rds/mysql/pricing/. [Accessed: Oct. 25, 2026].</w:t>
+      </w:r>
+    </w:p>
+    <w:p>
+      <w:pPr>
+        <w:jc w:val="both"/>
+        <w:spacing w:before="30" w:after="150" w:line="260" w:lineRule="auto"/>
+        <w:ind w:left="420" w:firstLine="-420"/>
+      </w:pPr>
+      <w:r>
+        <w:rPr>
+          <w:rFonts w:ascii="Times New Roman" w:hAnsi="Times New Roman" w:cs="Times New Roman" w:eastAsia="Times New Roman"/>
+          <w:sz w:val="20"/>
+          <w:szCs w:val="20"/>
+          <w:color w:val="222222"/>
+        </w:rPr>
+        <w:t xml:space="preserve">[13] Amazon Web Services, “Amazon EBS Pricing,” AWS. [Online]. Available: https://aws.amazon.com/ebs/pricing/. [Accessed: Oct. 25, 2026].</w:t>
+      </w:r>
+    </w:p>
+    <w:p>
+      <w:pPr>
+        <w:jc w:val="both"/>
+        <w:spacing w:before="30" w:after="150" w:line="260" w:lineRule="auto"/>
+        <w:ind w:left="420" w:firstLine="-420"/>
+      </w:pPr>
+      <w:r>
+        <w:rPr>
+          <w:rFonts w:ascii="Times New Roman" w:hAnsi="Times New Roman" w:cs="Times New Roman" w:eastAsia="Times New Roman"/>
+          <w:sz w:val="20"/>
+          <w:szCs w:val="20"/>
+          <w:color w:val="222222"/>
+        </w:rPr>
+        <w:t xml:space="preserve">[14] Jeff Barr, “New – AWS Public IPv4 Address Charge + Public IP Insights,” AWS News Blog, Jul. 28, 2023. [Online]. Available: https://aws.amazon.com/blogs/aws/new-aws-public-ipv4-address-charge-public-ip-insights/. [Accessed: Oct. 25, 2026].</w:t>
+      </w:r>
+    </w:p>
+    <w:p>
+      <w:pPr>
+        <w:jc w:val="both"/>
+        <w:spacing w:before="30" w:after="150" w:line="260" w:lineRule="auto"/>
+        <w:ind w:left="420" w:firstLine="-420"/>
+      </w:pPr>
+      <w:r>
+        <w:rPr>
+          <w:rFonts w:ascii="Times New Roman" w:hAnsi="Times New Roman" w:cs="Times New Roman" w:eastAsia="Times New Roman"/>
+          <w:sz w:val="20"/>
+          <w:szCs w:val="20"/>
+          <w:color w:val="222222"/>
+        </w:rPr>
+        <w:t xml:space="preserve">[15] Amazon Web Services, “Amazon ECR Pricing” and “AWS Secrets Manager Pricing,” AWS. [Online]. Available: https://aws.amazon.com/ecr/pricing/ and https://aws.amazon.com/secrets-manager/pricing/. [Accessed: Oct. 25, 2026].</w:t>
       </w:r>
     </w:p>
     <w:sectPr>

</xml_diff>

<commit_message>
Add team registration numbers to report
</commit_message>
<xml_diff>
--- a/CCD_Lab_Mini_Project_Report.docx
+++ b/CCD_Lab_Mini_Project_Report.docx
@@ -145,7 +145,7 @@
           <w:i/>
           <w:color w:val="666666"/>
         </w:rPr>
-        <w:t xml:space="preserve">Registration numbers: to be added</w:t>
+        <w:t xml:space="preserve">Registration numbers: Myisha Siddiqui — 240905560; Manan Bhasin — 240905492; Rishabh Raj — 240905420</w:t>
       </w:r>
     </w:p>
     <w:p>
@@ -318,7 +318,7 @@
           <w:i/>
           <w:color w:val="7F6000"/>
         </w:rPr>
-        <w:t xml:space="preserve">Student registration numbers are to be entered before final submission.</w:t>
+        <w:t xml:space="preserve">Student registration numbers: Myisha Siddiqui — 240905560; Manan Bhasin — 240905492; Rishabh Raj — 240905420.</w:t>
       </w:r>
     </w:p>
     <w:p>

</xml_diff>

<commit_message>
Update report and live demo deployment guidance
</commit_message>
<xml_diff>
--- a/CCD_Lab_Mini_Project_Report.docx
+++ b/CCD_Lab_Mini_Project_Report.docx
@@ -582,7 +582,7 @@
           <w:szCs w:val="24"/>
           <w:color w:val="222222"/>
         </w:rPr>
-        <w:t xml:space="preserve">The live demonstration verified browser/API operation, a bounded read-only load test, HPA scale-up and scale-down, Deployment replacement after pod deletion, and container restart after a controlled liveness-probe failure. Prometheus, kube-state-metrics, and Grafana were deployed privately in the cluster. The load run completed 5,699 requests at approximately 43.7 requests per second with no failed requests and a p95 response time of 403.98 ms. The evidence supports pod-level elasticity and recovery on the demonstration host; it does not establish EC2 host failover or multi-node high availability.</w:t>
+        <w:t xml:space="preserve">The live demonstration verified browser/API operation, a bounded read-only load test, HPA scale-up and scale-down, Deployment replacement after pod deletion, and container restart after a controlled liveness-probe failure. Prometheus, kube-state-metrics, and Grafana were deployed privately in the cluster. The live six-panel Grafana operations dashboard was also verified in a browser through an SSM remote-host port-forward; its ClusterIP remains private and no public monitoring endpoint was added. The load run completed 5,699 requests at approximately 43.7 requests per second with no failed requests and a p95 response time of 403.98 ms. The evidence supports pod-level elasticity and recovery on the demonstration host; it does not establish EC2 host failover or multi-node high availability.</w:t>
       </w:r>
     </w:p>
     <w:p>
@@ -1766,7 +1766,7 @@
           <w:szCs w:val="24"/>
           <w:color w:val="222222"/>
         </w:rPr>
-        <w:t xml:space="preserve">Prometheus scrapes Spring Boot Actuator's Prometheus endpoint and kube-state-metrics at 15-second intervals. Grafana reads from Prometheus and presents six panels: request rate, 5xx response rate, mean request duration, ready versus desired API replicas, JVM heap, and process CPU. The monitoring services use private ClusterIP endpoints and are reached through an authorized Systems Manager port-forward. Prometheus retains up to six hours or 256 MB in temporary storage; Grafana's local database is also temporary [6]–[8].</w:t>
+        <w:t xml:space="preserve">Prometheus scrapes Spring Boot Actuator's Prometheus endpoint and kube-state-metrics at 15-second intervals. Grafana reads from Prometheus and presents six panels: request rate, 5xx response rate, mean request duration, ready versus desired API replicas, JVM heap, and process CPU. The monitoring services use private ClusterIP endpoints and are reached through an authorized Systems Manager port-forward. For the live demonstration, the current Grafana ClusterIP is forwarded with AWS-StartPortForwardingSessionToRemoteHost to local port 3000 and opened at http://localhost:3000/d/student-task-manager-ops/student-task-manager-operations. The tunnel must remain active; this does not expose Grafana publicly. Prometheus retains up to six hours or 256 MB in temporary storage; Grafana's local database is also temporary [6]–[8].</w:t>
       </w:r>
     </w:p>
     <w:p>
@@ -3270,7 +3270,7 @@
           <w:szCs w:val="24"/>
           <w:color w:val="222222"/>
         </w:rPr>
-        <w:t xml:space="preserve">The pod deletion test first encountered an expired ECR pull credential, so the replacement could not initially retrieve its image. After refreshing the pull secret, a replacement pod became ready. This is a practical operational limitation: ECR authorization tokens expire after 12 hours, and the demo currently needs a refresh before later image pulls. GitHub Actions validates and packages the project but does not yet publish the image to ECR or roll out a deployment. The recorded CI run is [9].</w:t>
+        <w:t xml:space="preserve">The pod deletion test first encountered an expired ECR pull credential, so the replacement could not initially retrieve its image. After refreshing the pull secret, a replacement pod became ready. This is a practical operational limitation: ECR authorization tokens expire after 12 hours, and the demo currently needs a refresh before later image pulls. GitHub Actions validates and packages the project but does not yet publish the image to ECR or roll out a deployment. The recorded CI run is [9]. A read-only AWS check confirmed the Sydney account and demo instance, but the intended student-task-manager-github-actions role is absent. AWS Organizations SCP p-dz3d6hmi explicitly denied iam:CreateOpenIDConnectProvider and iam:GetOpenIDConnectProvider. An Organizations administrator must allow the OIDC setup or create the provider and role; the GitHub aws-demo environment and repository variables also remain unconfigured. No image publication or release deployment has been triggered.</w:t>
       </w:r>
     </w:p>
     <w:p>
@@ -3755,7 +3755,7 @@
           <w:szCs w:val="24"/>
           <w:color w:val="222222"/>
         </w:rPr>
-        <w:t xml:space="preserve">These values are a snapshot rather than a long-term performance profile. A Grafana PNG was not captured because the image-renderer endpoint was unavailable in this environment; the dashboard configuration, datasource health, panel response, Prometheus targets, and live queries were verified. Prometheus uses temporary storage with up to six hours of retention, and Grafana's local database is temporary. Consequently, monitoring history is not durable across pod replacement.</w:t>
+        <w:t xml:space="preserve">These values are a snapshot rather than a long-term performance profile. A Grafana PNG was not captured because the image-renderer endpoint was unavailable; the saved monitoring summary is reconstructed from recorded Prometheus values and is not a Grafana screenshot. A later live check returned database: ok from Grafana /api/health on version 12.4.13 and retrieved the provisioned six-panel operations dashboard by UID. During a live demo, the dashboard is available at http://localhost:3000/d/student-task-manager-ops/student-task-manager-operations while the SSM tunnel to the private ClusterIP is active. Prometheus uses temporary storage with up to six hours of retention, and Grafana's local database is temporary. Consequently, monitoring history is not durable across pod replacement.</w:t>
       </w:r>
     </w:p>
     <w:p>
@@ -3867,7 +3867,7 @@
           <w:szCs w:val="24"/>
           <w:color w:val="222222"/>
         </w:rPr>
-        <w:t xml:space="preserve">This is a list-price model, not the AWS account bill. AWS CLI credentials were unavailable for Cost Explorer verification. The estimate excludes taxes, variable data transfer, backup/snapshot amounts beyond included allowances, any RDS CPU-credit surplus, and other account resources. Confirm current regional rates and free-plan eligibility in the AWS billing console and Pricing Calculator.</w:t>
+        <w:t xml:space="preserve">This is a list-price model, not the AWS account bill. Cost Explorer was not queried, so actual usage, remaining credits, and free-plan eligibility have not been verified. The estimate excludes taxes, variable data transfer, backup/snapshot amounts beyond included allowances, any RDS CPU-credit surplus, and other account resources. Confirm current regional rates and free-plan eligibility in the AWS billing console and Pricing Calculator.</w:t>
       </w:r>
     </w:p>
     <w:p>
@@ -3917,7 +3917,7 @@
           <w:szCs w:val="24"/>
           <w:color w:val="222222"/>
         </w:rPr>
-        <w:t xml:space="preserve">The project delivered a browser-based Student Task Manager backed by MySQL and deployed it as a Docker container on Kubernetes running in AWS. Terraform defines the cloud foundation, Amazon ECR stores the application image, and Systems Manager provides administrative access without opening SSH. Kubernetes health probes and a Deployment maintain application pods, while a CPU-based HPA adjusts replicas from one to two. Prometheus, kube-state-metrics, and Grafana provide a private monitoring path for application and cluster behavior.</w:t>
+        <w:t xml:space="preserve">The project delivered a browser-based Student Task Manager backed by MySQL and deployed it as a Docker container on Kubernetes running in AWS. Terraform defines the cloud foundation, Amazon ECR stores the application image, and Systems Manager provides administrative access without opening SSH. Kubernetes health probes and a Deployment maintain application pods, while a CPU-based HPA adjusts replicas from one to two. Prometheus, kube-state-metrics, and Grafana provide a private monitoring path for application and cluster behavior; the six-panel Grafana dashboard was verified live through the private SSM port-forward.</w:t>
       </w:r>
     </w:p>
     <w:p>
@@ -3949,7 +3949,7 @@
           <w:szCs w:val="24"/>
           <w:color w:val="222222"/>
         </w:rPr>
-        <w:t xml:space="preserve">The main limitations are the single EC2 node, the HPA maximum of two pods, temporary Prometheus and Grafana storage, expiring ECR pull credentials, and the manual AWS release workflow prepared but awaiting OIDC role configuration in GitHub Actions. Authentication and per-student task ownership are also outside the current application scope. The experiments do not prove host-level availability, multi-node resilience, production security, or lower AWS costs from pod scaling; the underlying EC2 and RDS remain provisioned at fixed capacity.</w:t>
+        <w:t xml:space="preserve">The main limitations are the single EC2 node, the HPA maximum of two pods, temporary Prometheus and Grafana storage, expiring ECR pull credentials, and the manual AWS release workflow. That workflow remains inactive because AWS Organizations SCP p-dz3d6hmi denied GitHub OIDC provider creation; an Organizations administrator must resolve the restriction, and the GitHub environment and repository variables still need configuration. Authentication and per-student task ownership are also outside the current application scope. The experiments do not prove host-level availability, multi-node resilience, production security, or lower AWS costs from pod scaling; the underlying EC2 and RDS remain provisioned at fixed capacity.</w:t>
       </w:r>
     </w:p>
     <w:p>

</xml_diff>